<commit_message>
Frontend dependecies are updated.
</commit_message>
<xml_diff>
--- a/Pump_Anomaly_Detection_Technical_Overview.docx
+++ b/Pump_Anomaly_Detection_Technical_Overview.docx
@@ -136,8 +136,9 @@
           <w:color w:val="555555"/>
           <w:sz w:val="22"/>
           <w:szCs w:val="22"/>
+          <w:lang w:val="en-US"/>
         </w:rPr>
-        <w:t xml:space="preserve">The system is fully deployed on AWS cloud infrastructure, accessible via a web interface, and delivers explainable predictions — meaning maintenance engineers receive not just an alert, but a clear, human-readable reason for why an anomaly was detected.</w:t>
+        <w:t>The system is fully deployed on AWS cloud infrastructure, accessible via a web interface, and delivers explainable predictions — meaning maintenance engineers receive not just an alert, but a clear, human-readable reason for why an anomaly was detected.</w:t>
       </w:r>
     </w:p>
     <w:p xmlns:wp14="http://schemas.microsoft.com/office/word/2010/wordml" wp14:textId="77777777">
@@ -1838,13 +1839,14 @@
       <w:r>
         <w:rPr>
           <w:rFonts w:ascii="Arial" w:hAnsi="Arial" w:eastAsia="Arial" w:cs="Arial"/>
-          <w:b/>
-          <w:bCs/>
+          <w:b w:val="1"/>
+          <w:bCs w:val="1"/>
           <w:color w:val="2E6DA4"/>
           <w:sz w:val="26"/>
           <w:szCs w:val="26"/>
+          <w:lang w:val="en-US"/>
         </w:rPr>
-        <w:t xml:space="preserve">3.2  Explainability Engine</w:t>
+        <w:t>3.2  Explainability Engine</w:t>
       </w:r>
     </w:p>
     <w:p xmlns:wp14="http://schemas.microsoft.com/office/word/2010/wordml" wp14:textId="77777777">

</xml_diff>